<commit_message>
added Inline (Simple) preview changes.
</commit_message>
<xml_diff>
--- a/docs/templates/WT_Broker_Snapshot_Technical_Design.docx
+++ b/docs/templates/WT_Broker_Snapshot_Technical_Design.docx
@@ -109,7 +109,7 @@
         <w:rPr>
           <w:sz w:val="20"/>
         </w:rPr>
-        <w:t xml:space="preserve">•  The LWC generates on demand, shows the PDF via a toggle between two preview modes (Salesforce's standard File Preview, or an inline pdf.js-based viewer â€” section 2.3), offers a Download option, shows the most recently generated snapshot on load, and keeps only the two most recent generated files attached to the Account.</w:t>
+        <w:t xml:space="preserve">•  The LWC generates on demand, shows the PDF via a toggle between three preview modes (Salesforce's standard File Preview, an inline pdf.js-based viewer, or a simple direct-URL iframe â€” section 2.3), offers a Download option, shows the most recently generated snapshot on load, and keeps only the two most recent generated files attached to the Account.</w:t>
       </w:r>
     </w:p>
     <w:p>
@@ -161,7 +161,7 @@
         <w:rPr>
           <w:sz w:val="20"/>
         </w:rPr>
-        <w:t xml:space="preserve">User clicks Generate in the LWC -&gt; Apex controller resolves the active Portwood template Id from a Custom Metadata Type setting -&gt; Portwood DocGenService merges the template against data returned by the Apex data provider -&gt; the resulting PDF is attached to the Account and read back -&gt; the controller returns the file (a download URL, plus inline base64 for small files) -&gt; the LWC shows a file card and displays the PDF in whichever of its two preview modes is currently selected (section 2.3). On every subsequent page load, the LWC asks the controller for the most recent previously generated snapshot and shows it the same way, so the user sees it (and when it was generated) without regenerating.</w:t>
+        <w:t xml:space="preserve">User clicks Generate in the LWC -&gt; Apex controller resolves the active Portwood template Id from a Custom Metadata Type setting -&gt; Portwood DocGenService merges the template against data returned by the Apex data provider -&gt; the resulting PDF is attached to the Account and read back -&gt; the controller returns the file (a download URL, plus inline base64 for small files) -&gt; the LWC shows a file card and displays the PDF in whichever of its three preview modes is currently selected (section 2.3). On every subsequent page load, the LWC asks the controller for the most recent previously generated snapshot and shows it the same way, so the user sees it (and when it was generated) without regenerating.</w:t>
       </w:r>
     </w:p>
     <w:p>
@@ -467,7 +467,7 @@
               <w:rPr>
                 <w:sz w:val="18"/>
               </w:rPr>
-              <w:t xml:space="preserve">Sits on the Account Lightning Record Page. Triggers generation on click, shows a Files-style card (name + generated date), displays the PDF via a toggle between Standard Preview and the Inline Viewer, offers Download, and loads the previously generated snapshot on page load.</w:t>
+              <w:t xml:space="preserve">Sits on the Account Lightning Record Page. Triggers generation on click, shows a Files-style card (name + generated date), displays the PDF via a 3-way toggle between preview modes (section 2.3), offers Download, and loads the previously generated snapshot on page load.</w:t>
             </w:r>
           </w:p>
         </w:tc>
@@ -644,7 +644,7 @@
           <w:color w:val="1F4E79"/>
           <w:sz w:val="24"/>
         </w:rPr>
-        <w:t xml:space="preserve">2.3 Two preview modes</w:t>
+        <w:t xml:space="preserve">2.3 Three preview modes</w:t>
       </w:r>
     </w:p>
     <w:p>
@@ -655,7 +655,7 @@
         <w:rPr>
           <w:sz w:val="20"/>
         </w:rPr>
-        <w:t xml:space="preserve">Lightning Web Security blocks &lt;iframe src="blob:..."&gt; outright, so a PDF's bytes cannot be embedded via a Blob object URL. Both LWCs offer two ways to show the file, switchable via a button-group toggle, so the two can be compared after deploying and one retired later:</w:t>
+        <w:t xml:space="preserve">Lightning Web Security blocks &lt;iframe src="blob:..."&gt; outright, so a PDF's bytes cannot be embedded via a Blob object URL. Both LWCs offer three ways to show the file, switchable via a button-group toggle, so they can be compared after deploying and narrowed down to one:</w:t>
       </w:r>
     </w:p>
     <w:tbl>
@@ -673,9 +673,9 @@
         <w:tblLook w:val="0000"/>
       </w:tblPr>
       <w:tblGrid>
-        <w:gridCol w:w="2000"/>
-        <w:gridCol w:w="4700"/>
-        <w:gridCol w:w="2450"/>
+        <w:gridCol w:w="1900"/>
+        <w:gridCol w:w="4600"/>
+        <w:gridCol w:w="2650"/>
       </w:tblGrid>
       <w:tr>
         <w:trPr>
@@ -683,7 +683,7 @@
         </w:trPr>
         <w:tc>
           <w:tcPr>
-            <w:tcW w:w="2000" w:type="dxa"/>
+            <w:tcW w:w="1900" w:type="dxa"/>
             <w:shd w:val="clear" w:color="auto" w:fill="002664"/>
           </w:tcPr>
           <w:p>
@@ -702,7 +702,7 @@
         </w:tc>
         <w:tc>
           <w:tcPr>
-            <w:tcW w:w="4700" w:type="dxa"/>
+            <w:tcW w:w="4600" w:type="dxa"/>
             <w:shd w:val="clear" w:color="auto" w:fill="002664"/>
           </w:tcPr>
           <w:p>
@@ -721,7 +721,7 @@
         </w:tc>
         <w:tc>
           <w:tcPr>
-            <w:tcW w:w="2450" w:type="dxa"/>
+            <w:tcW w:w="2650" w:type="dxa"/>
             <w:shd w:val="clear" w:color="auto" w:fill="002664"/>
           </w:tcPr>
           <w:p>
@@ -742,7 +742,7 @@
       <w:tr>
         <w:tc>
           <w:tcPr>
-            <w:tcW w:w="2000" w:type="dxa"/>
+            <w:tcW w:w="1900" w:type="dxa"/>
           </w:tcPr>
           <w:p>
             <w:pPr>
@@ -758,7 +758,7 @@
         </w:tc>
         <w:tc>
           <w:tcPr>
-            <w:tcW w:w="4700" w:type="dxa"/>
+            <w:tcW w:w="4600" w:type="dxa"/>
           </w:tcPr>
           <w:p>
             <w:pPr>
@@ -774,42 +774,42 @@
         </w:tc>
         <w:tc>
           <w:tcPr>
-            <w:tcW w:w="2450" w:type="dxa"/>
-          </w:tcPr>
-          <w:p>
-            <w:pPr>
-              <w:spacing w:before="20" w:after="20"/>
-            </w:pPr>
-            <w:r>
-              <w:rPr>
-                <w:sz w:val="18"/>
-              </w:rPr>
-              <w:t xml:space="preserve">Always available; no size limit, no extra dependency.</w:t>
-            </w:r>
-          </w:p>
-        </w:tc>
-      </w:tr>
-      <w:tr>
-        <w:tc>
-          <w:tcPr>
-            <w:tcW w:w="2000" w:type="dxa"/>
-            <w:shd w:val="clear" w:color="auto" w:fill="F2F5F9"/>
-          </w:tcPr>
-          <w:p>
-            <w:pPr>
-              <w:spacing w:before="20" w:after="20"/>
-            </w:pPr>
-            <w:r>
-              <w:rPr>
-                <w:sz w:val="18"/>
-              </w:rPr>
-              <w:t xml:space="preserve">Inline Viewer</w:t>
-            </w:r>
-          </w:p>
-        </w:tc>
-        <w:tc>
-          <w:tcPr>
-            <w:tcW w:w="4700" w:type="dxa"/>
+            <w:tcW w:w="2650" w:type="dxa"/>
+          </w:tcPr>
+          <w:p>
+            <w:pPr>
+              <w:spacing w:before="20" w:after="20"/>
+            </w:pPr>
+            <w:r>
+              <w:rPr>
+                <w:sz w:val="18"/>
+              </w:rPr>
+              <w:t xml:space="preserve">Always available; no size limit, no extra dependency, no admin setup.</w:t>
+            </w:r>
+          </w:p>
+        </w:tc>
+      </w:tr>
+      <w:tr>
+        <w:tc>
+          <w:tcPr>
+            <w:tcW w:w="1900" w:type="dxa"/>
+            <w:shd w:val="clear" w:color="auto" w:fill="F2F5F9"/>
+          </w:tcPr>
+          <w:p>
+            <w:pPr>
+              <w:spacing w:before="20" w:after="20"/>
+            </w:pPr>
+            <w:r>
+              <w:rPr>
+                <w:sz w:val="18"/>
+              </w:rPr>
+              <w:t xml:space="preserve">Inline (pdf.js)</w:t>
+            </w:r>
+          </w:p>
+        </w:tc>
+        <w:tc>
+          <w:tcPr>
+            <w:tcW w:w="4600" w:type="dxa"/>
             <w:shd w:val="clear" w:color="auto" w:fill="F2F5F9"/>
           </w:tcPr>
           <w:p>
@@ -826,18 +826,68 @@
         </w:tc>
         <w:tc>
           <w:tcPr>
-            <w:tcW w:w="2450" w:type="dxa"/>
-            <w:shd w:val="clear" w:color="auto" w:fill="F2F5F9"/>
-          </w:tcPr>
-          <w:p>
-            <w:pPr>
-              <w:spacing w:before="20" w:after="20"/>
-            </w:pPr>
-            <w:r>
-              <w:rPr>
-                <w:sz w:val="18"/>
-              </w:rPr>
-              <w:t xml:space="preserve">Only when the controller returned inline base64 data â€” files at/under ~3.5MB (inlineDownloadMaxBytes). Larger files show a fallback message pointing to Standard Preview / Download.</w:t>
+            <w:tcW w:w="2650" w:type="dxa"/>
+            <w:shd w:val="clear" w:color="auto" w:fill="F2F5F9"/>
+          </w:tcPr>
+          <w:p>
+            <w:pPr>
+              <w:spacing w:before="20" w:after="20"/>
+            </w:pPr>
+            <w:r>
+              <w:rPr>
+                <w:sz w:val="18"/>
+              </w:rPr>
+              <w:t xml:space="preserve">Only when the controller returned inline base64 data â€” files at/under ~3.5MB (inlineDownloadMaxBytes). Larger files show a fallback message. No admin setup required.</w:t>
+            </w:r>
+          </w:p>
+        </w:tc>
+      </w:tr>
+      <w:tr>
+        <w:tc>
+          <w:tcPr>
+            <w:tcW w:w="1900" w:type="dxa"/>
+          </w:tcPr>
+          <w:p>
+            <w:pPr>
+              <w:spacing w:before="20" w:after="20"/>
+            </w:pPr>
+            <w:r>
+              <w:rPr>
+                <w:sz w:val="18"/>
+              </w:rPr>
+              <w:t xml:space="preserve">Inline (Simple)</w:t>
+            </w:r>
+          </w:p>
+        </w:tc>
+        <w:tc>
+          <w:tcPr>
+            <w:tcW w:w="4600" w:type="dxa"/>
+          </w:tcPr>
+          <w:p>
+            <w:pPr>
+              <w:spacing w:before="20" w:after="20"/>
+            </w:pPr>
+            <w:r>
+              <w:rPr>
+                <w:sz w:val="18"/>
+              </w:rPr>
+              <w:t xml:space="preserve">An &lt;iframe src={downloadUrl}&gt; pointed directly at the file's own servlet download URL (/sfc/servlet.shepherd/version/download/{id} â€” https://, same-origin, never blocked by LWS). This is Salesforce's own documented pattern from the Salesforce Developers blog "Display PDF Files with Lightning Web Components".</w:t>
+            </w:r>
+          </w:p>
+        </w:tc>
+        <w:tc>
+          <w:tcPr>
+            <w:tcW w:w="2650" w:type="dxa"/>
+          </w:tcPr>
+          <w:p>
+            <w:pPr>
+              <w:spacing w:before="20" w:after="20"/>
+            </w:pPr>
+            <w:r>
+              <w:rPr>
+                <w:sz w:val="18"/>
+              </w:rPr>
+              <w:t xml:space="preserve">No size limit and no static resource â€” but only renders inline if Setup -&gt; Security -&gt; File Upload and Download Security -&gt; PDF is set to Execute in Browser (org-wide, admin-controlled; Hybrid is not enough â€” it still downloads modern Salesforce Files). Until set, this mode downloads the file instead of showing it.</w:t>
             </w:r>
           </w:p>
         </w:tc>
@@ -859,7 +909,18 @@
         <w:rPr>
           <w:sz w:val="20"/>
         </w:rPr>
-        <w:t xml:space="preserve">Why postMessage rather than direct DOM access: Winter '23 onward, LWS permits a Lightning Web Component to read/traverse a same-origin iframe's content, but the base64 payload here can be large and the viewer's own module script (viewer.js) needs to run its own decode/render logic regardless â€” posting the data across is simpler and keeps the viewer fully self-contained (it could just as easily be loaded standalone for testing). The viewer's message listener checks event.origin against window.origin before acting, and the LWC does the same on the return channel, so only this same-origin iframe pair can drive each other.</w:t>
+        <w:t xml:space="preserve">Why postMessage rather than direct DOM access for the pdf.js mode: Winter '23 onward, LWS permits a Lightning Web Component to read/traverse a same-origin iframe's content, but the base64 payload here can be large and the viewer's own module script (viewer.js) needs to run its own decode/render logic regardless â€” posting the data across is simpler and keeps the viewer fully self-contained (it could just as easily be loaded standalone for testing). The viewer's message listener checks event.origin against window.origin before acting, and the LWC does the same on the return channel, so only this same-origin iframe pair can drive each other.</w:t>
+      </w:r>
+    </w:p>
+    <w:p>
+      <w:pPr>
+        <w:spacing w:before="0" w:after="140"/>
+      </w:pPr>
+      <w:r>
+        <w:rPr>
+          <w:sz w:val="20"/>
+        </w:rPr>
+        <w:t xml:space="preserve">The Inline (Simple) mode needs no such protocol at all: the iframe's src is template-bound straight to the same downloadUrl the Download button uses, so whether it renders inline or triggers a download is determined entirely by the org's File Upload and Download Security setting, not by any code in this component.</w:t>
       </w:r>
     </w:p>
     <w:p>
@@ -977,7 +1038,7 @@
         <w:rPr>
           <w:sz w:val="20"/>
         </w:rPr>
-        <w:t xml:space="preserve">7.  The LWC updates its file card (name, generated date) and shows the PDF using whichever preview mode is currently selected (section 2.3) â€” Standard Preview via NavigationMixin, or the Inline Viewer via postMessage â€” and enables the Download button.</w:t>
+        <w:t xml:space="preserve">7.  The LWC updates its file card (name, generated date) and shows the PDF using whichever of the three preview modes is currently selected (section 2.3), and enables the Download button.</w:t>
       </w:r>
     </w:p>
     <w:p>
@@ -5036,7 +5097,7 @@
         <w:rPr>
           <w:sz w:val="20"/>
         </w:rPr>
-        <w:t xml:space="preserve">•  Two preview modes ship side by side deliberately (section 2.3) because neither could be validated against a live org during this design: Standard Preview depends on the filePreview named page behaving as documented, and the Inline Viewer depends on LWS actually permitting postMessage into a same-origin static-resource iframe in this org's specific configuration. Confirm both after deploying, then remove the toggle and the losing mode's code (and, if Inline Viewer loses, the WT_BrokerSnapshotPdfViewer static resource) rather than leaving both indefinitely.</w:t>
+        <w:t xml:space="preserve">•  Three preview modes ship side by side deliberately (section 2.3) because none could be validated against a live org during this design: Standard Preview depends on the filePreview named page behaving as documented, Inline (pdf.js) depends on LWS actually permitting postMessage into a same-origin static-resource iframe in this org's specific configuration, and Inline (Simple) depends on an admin having set File Upload and Download Security -&gt; PDF -&gt; Execute in Browser. Confirm all three after deploying, then remove the toggle and the losing modes' code (and, if Inline (pdf.js) loses, the WT_BrokerSnapshotPdfViewer static resource) rather than leaving all three indefinitely.</w:t>
       </w:r>
     </w:p>
     <w:p>
@@ -5048,7 +5109,19 @@
         <w:rPr>
           <w:sz w:val="20"/>
         </w:rPr>
-        <w:t xml:space="preserve">•  The Inline Viewer only works for files at/under inlineDownloadMaxBytes (~3.5MB) â€” larger snapshots always fall back to Standard Preview / Download. Broker Snapshot PDFs are text/table-heavy business documents and comfortably under this limit in practice, but this is worth confirming against a real generated file.</w:t>
+        <w:t xml:space="preserve">•  The Inline (pdf.js) mode only works for files at/under inlineDownloadMaxBytes (~3.5MB) â€” larger snapshots fall back to another mode. Broker Snapshot PDFs are text/table-heavy business documents and comfortably under this limit in practice, but this is worth confirming against a real generated file.</w:t>
+      </w:r>
+    </w:p>
+    <w:p>
+      <w:pPr>
+        <w:spacing w:before="0" w:after="60"/>
+        <w:ind w:left="360" w:hanging="180"/>
+      </w:pPr>
+      <w:r>
+        <w:rPr>
+          <w:sz w:val="20"/>
+        </w:rPr>
+        <w:t xml:space="preserve">•  Inline (Simple)'s File Upload and Download Security setting is per-file-type but org-wide â€” setting PDF to Execute in Browser affects every PDF served through the servlet download URL pattern across the org, not just Broker Snapshot files. This is an admin/security decision to make deliberately, not a side effect of deploying this feature.</w:t>
       </w:r>
     </w:p>
     <w:p>
@@ -5292,7 +5365,7 @@
               <w:rPr>
                 <w:sz w:val="18"/>
               </w:rPr>
-              <w:t xml:space="preserve">Independent â€” wt_BrokerSnapshotExternalDocGen is a separate bundle (own Apex imports, own labels), not a parameterized/shared component. Its two preview modes (section 2.3) work identically to the Dynamic LWC's.</w:t>
+              <w:t xml:space="preserve">Independent â€” wt_BrokerSnapshotExternalDocGen is a separate bundle (own Apex imports, own labels), not a parameterized/shared component. Its three preview modes (section 2.3) work identically to the Dynamic LWC's.</w:t>
             </w:r>
           </w:p>
         </w:tc>
@@ -5310,7 +5383,7 @@
               <w:rPr>
                 <w:sz w:val="18"/>
               </w:rPr>
-              <w:t xml:space="preserve">Inline Viewer static resource</w:t>
+              <w:t xml:space="preserve">Inline (pdf.js) static resource</w:t>
             </w:r>
           </w:p>
         </w:tc>

</xml_diff>